<commit_message>
feat: add direct one-click HTTP download endpoints for Word technical report
- backend/app/main.py: added /download/report and /api/v1/download/report endpoints serving Word report with attachment headers
- frontend/public: added FIR_Sahayak_Complete_Technical_Report.docx for direct HTTP access via Vite (port 5173)
- docs: regenerated enriched Word report (73 KB) with all 19 sections, 5 master tables, and 55 Q&As
</commit_message>
<xml_diff>
--- a/docs/FIR_Sahayak_Complete_Technical_Report.docx
+++ b/docs/FIR_Sahayak_Complete_Technical_Report.docx
@@ -4,7 +4,7 @@
   <w:body>
     <w:p>
       <w:pPr>
-        <w:spacing w:before="720" w:after="120"/>
+        <w:spacing w:before="600" w:after="120"/>
         <w:jc w:val="center"/>
       </w:pPr>
       <w:r>
@@ -20,7 +20,7 @@
     </w:p>
     <w:p>
       <w:pPr>
-        <w:spacing w:before="360" w:after="200"/>
+        <w:spacing w:before="320" w:after="200"/>
         <w:jc w:val="center"/>
       </w:pPr>
       <w:r>
@@ -35,7 +35,7 @@
       <w:r>
         <w:rPr>
           <w:color w:val="1E293B"/>
-          <w:sz w:val="28"/>
+          <w:sz w:val="26"/>
         </w:rPr>
         <w:t>Complete Technical Architecture, Cloud &amp; Database Inspection,</w:t>
         <w:br/>
@@ -58,8 +58,8 @@
             <w:tcW w:type="dxa" w:w="3168"/>
             <w:shd w:fill="F8FAFC"/>
             <w:tcMar>
-              <w:top w:w="80" w:type="dxa"/>
-              <w:bottom w:w="80" w:type="dxa"/>
+              <w:top w:w="70" w:type="dxa"/>
+              <w:bottom w:w="70" w:type="dxa"/>
               <w:left w:w="120" w:type="dxa"/>
               <w:right w:w="120" w:type="dxa"/>
             </w:tcMar>
@@ -79,8 +79,8 @@
           <w:tcPr>
             <w:tcW w:type="dxa" w:w="6912"/>
             <w:tcMar>
-              <w:top w:w="80" w:type="dxa"/>
-              <w:bottom w:w="80" w:type="dxa"/>
+              <w:top w:w="70" w:type="dxa"/>
+              <w:bottom w:w="70" w:type="dxa"/>
               <w:left w:w="120" w:type="dxa"/>
               <w:right w:w="120" w:type="dxa"/>
             </w:tcMar>
@@ -102,8 +102,8 @@
             <w:tcW w:type="dxa" w:w="3168"/>
             <w:shd w:fill="F8FAFC"/>
             <w:tcMar>
-              <w:top w:w="80" w:type="dxa"/>
-              <w:bottom w:w="80" w:type="dxa"/>
+              <w:top w:w="70" w:type="dxa"/>
+              <w:bottom w:w="70" w:type="dxa"/>
               <w:left w:w="120" w:type="dxa"/>
               <w:right w:w="120" w:type="dxa"/>
             </w:tcMar>
@@ -123,8 +123,8 @@
           <w:tcPr>
             <w:tcW w:type="dxa" w:w="6912"/>
             <w:tcMar>
-              <w:top w:w="80" w:type="dxa"/>
-              <w:bottom w:w="80" w:type="dxa"/>
+              <w:top w:w="70" w:type="dxa"/>
+              <w:bottom w:w="70" w:type="dxa"/>
               <w:left w:w="120" w:type="dxa"/>
               <w:right w:w="120" w:type="dxa"/>
             </w:tcMar>
@@ -146,8 +146,8 @@
             <w:tcW w:type="dxa" w:w="3168"/>
             <w:shd w:fill="F8FAFC"/>
             <w:tcMar>
-              <w:top w:w="80" w:type="dxa"/>
-              <w:bottom w:w="80" w:type="dxa"/>
+              <w:top w:w="70" w:type="dxa"/>
+              <w:bottom w:w="70" w:type="dxa"/>
               <w:left w:w="120" w:type="dxa"/>
               <w:right w:w="120" w:type="dxa"/>
             </w:tcMar>
@@ -159,7 +159,7 @@
                 <w:color w:val="112D4E"/>
                 <w:sz w:val="18"/>
               </w:rPr>
-              <w:t>Current Status</w:t>
+              <w:t>Current Operating Status</w:t>
             </w:r>
           </w:p>
         </w:tc>
@@ -167,8 +167,8 @@
           <w:tcPr>
             <w:tcW w:type="dxa" w:w="6912"/>
             <w:tcMar>
-              <w:top w:w="80" w:type="dxa"/>
-              <w:bottom w:w="80" w:type="dxa"/>
+              <w:top w:w="70" w:type="dxa"/>
+              <w:bottom w:w="70" w:type="dxa"/>
               <w:left w:w="120" w:type="dxa"/>
               <w:right w:w="120" w:type="dxa"/>
             </w:tcMar>
@@ -190,8 +190,8 @@
             <w:tcW w:type="dxa" w:w="3168"/>
             <w:shd w:fill="F8FAFC"/>
             <w:tcMar>
-              <w:top w:w="80" w:type="dxa"/>
-              <w:bottom w:w="80" w:type="dxa"/>
+              <w:top w:w="70" w:type="dxa"/>
+              <w:bottom w:w="70" w:type="dxa"/>
               <w:left w:w="120" w:type="dxa"/>
               <w:right w:w="120" w:type="dxa"/>
             </w:tcMar>
@@ -203,7 +203,7 @@
                 <w:color w:val="112D4E"/>
                 <w:sz w:val="18"/>
               </w:rPr>
-              <w:t>Automated Tests</w:t>
+              <w:t>Automated Tests Status</w:t>
             </w:r>
           </w:p>
         </w:tc>
@@ -211,8 +211,8 @@
           <w:tcPr>
             <w:tcW w:type="dxa" w:w="6912"/>
             <w:tcMar>
-              <w:top w:w="80" w:type="dxa"/>
-              <w:bottom w:w="80" w:type="dxa"/>
+              <w:top w:w="70" w:type="dxa"/>
+              <w:bottom w:w="70" w:type="dxa"/>
               <w:left w:w="120" w:type="dxa"/>
               <w:right w:w="120" w:type="dxa"/>
             </w:tcMar>
@@ -234,8 +234,8 @@
             <w:tcW w:type="dxa" w:w="3168"/>
             <w:shd w:fill="F8FAFC"/>
             <w:tcMar>
-              <w:top w:w="80" w:type="dxa"/>
-              <w:bottom w:w="80" w:type="dxa"/>
+              <w:top w:w="70" w:type="dxa"/>
+              <w:bottom w:w="70" w:type="dxa"/>
               <w:left w:w="120" w:type="dxa"/>
               <w:right w:w="120" w:type="dxa"/>
             </w:tcMar>
@@ -255,8 +255,8 @@
           <w:tcPr>
             <w:tcW w:type="dxa" w:w="6912"/>
             <w:tcMar>
-              <w:top w:w="80" w:type="dxa"/>
-              <w:bottom w:w="80" w:type="dxa"/>
+              <w:top w:w="70" w:type="dxa"/>
+              <w:bottom w:w="70" w:type="dxa"/>
               <w:left w:w="120" w:type="dxa"/>
               <w:right w:w="120" w:type="dxa"/>
             </w:tcMar>
@@ -278,8 +278,8 @@
             <w:tcW w:type="dxa" w:w="3168"/>
             <w:shd w:fill="F8FAFC"/>
             <w:tcMar>
-              <w:top w:w="80" w:type="dxa"/>
-              <w:bottom w:w="80" w:type="dxa"/>
+              <w:top w:w="70" w:type="dxa"/>
+              <w:bottom w:w="70" w:type="dxa"/>
               <w:left w:w="120" w:type="dxa"/>
               <w:right w:w="120" w:type="dxa"/>
             </w:tcMar>
@@ -299,8 +299,8 @@
           <w:tcPr>
             <w:tcW w:type="dxa" w:w="6912"/>
             <w:tcMar>
-              <w:top w:w="80" w:type="dxa"/>
-              <w:bottom w:w="80" w:type="dxa"/>
+              <w:top w:w="70" w:type="dxa"/>
+              <w:bottom w:w="70" w:type="dxa"/>
               <w:left w:w="120" w:type="dxa"/>
               <w:right w:w="120" w:type="dxa"/>
             </w:tcMar>
@@ -332,7 +332,255 @@
           <w:rFonts w:ascii="Calibri" w:hAnsi="Calibri"/>
           <w:b/>
           <w:color w:val="0F5132"/>
-          <w:sz w:val="32"/>
+          <w:sz w:val="30"/>
+        </w:rPr>
+        <w:t>Document Table of Contents</w:t>
+      </w:r>
+    </w:p>
+    <w:p>
+      <w:pPr>
+        <w:spacing w:before="40" w:after="40"/>
+      </w:pPr>
+      <w:r>
+        <w:rPr>
+          <w:color w:val="1E293B"/>
+          <w:sz w:val="19"/>
+        </w:rPr>
+        <w:t>1. Executive Project Overview (Problem, Objectives, Hierarchy, Implementation Status)</w:t>
+      </w:r>
+    </w:p>
+    <w:p>
+      <w:pPr>
+        <w:spacing w:before="40" w:after="40"/>
+      </w:pPr>
+      <w:r>
+        <w:rPr>
+          <w:color w:val="1E293B"/>
+          <w:sz w:val="19"/>
+        </w:rPr>
+        <w:t>2. End-to-End System Architecture &amp; Lifecycle Walkthrough</w:t>
+      </w:r>
+    </w:p>
+    <w:p>
+      <w:pPr>
+        <w:spacing w:before="40" w:after="40"/>
+      </w:pPr>
+      <w:r>
+        <w:rPr>
+          <w:color w:val="1E293B"/>
+          <w:sz w:val="19"/>
+        </w:rPr>
+        <w:t>3. Frontend Architecture &amp; Exhaustive Audit of All 17 Modules</w:t>
+      </w:r>
+    </w:p>
+    <w:p>
+      <w:pPr>
+        <w:spacing w:before="40" w:after="40"/>
+      </w:pPr>
+      <w:r>
+        <w:rPr>
+          <w:color w:val="1E293B"/>
+          <w:sz w:val="19"/>
+        </w:rPr>
+        <w:t>4. Backend Architecture &amp; Complete API Inventory (All 50 Endpoints)</w:t>
+      </w:r>
+    </w:p>
+    <w:p>
+      <w:pPr>
+        <w:spacing w:before="40" w:after="40"/>
+      </w:pPr>
+      <w:r>
+        <w:rPr>
+          <w:color w:val="1E293B"/>
+          <w:sz w:val="19"/>
+        </w:rPr>
+        <w:t>5. Database Architecture &amp; Table Inventory (Relational &amp; FTS5 Tables)</w:t>
+      </w:r>
+    </w:p>
+    <w:p>
+      <w:pPr>
+        <w:spacing w:before="40" w:after="40"/>
+      </w:pPr>
+      <w:r>
+        <w:rPr>
+          <w:color w:val="1E293B"/>
+          <w:sz w:val="19"/>
+        </w:rPr>
+        <w:t>6. Supabase PostgreSQL &amp; Cloud Storage Infrastructure Status</w:t>
+      </w:r>
+    </w:p>
+    <w:p>
+      <w:pPr>
+        <w:spacing w:before="40" w:after="40"/>
+      </w:pPr>
+      <w:r>
+        <w:rPr>
+          <w:color w:val="1E293B"/>
+          <w:sz w:val="19"/>
+        </w:rPr>
+        <w:t>7. Multi-Format Upload, OCR &amp; Document Processing Pipeline</w:t>
+      </w:r>
+    </w:p>
+    <w:p>
+      <w:pPr>
+        <w:spacing w:before="40" w:after="40"/>
+      </w:pPr>
+      <w:r>
+        <w:rPr>
+          <w:color w:val="1E293B"/>
+          <w:sz w:val="19"/>
+        </w:rPr>
+        <w:t>8. Artificial Intelligence Models &amp; Provider Integrations (Gemini 2.0 Flash)</w:t>
+      </w:r>
+    </w:p>
+    <w:p>
+      <w:pPr>
+        <w:spacing w:before="40" w:after="40"/>
+      </w:pPr>
+      <w:r>
+        <w:rPr>
+          <w:color w:val="1E293B"/>
+          <w:sz w:val="19"/>
+        </w:rPr>
+        <w:t>9. Grounded Retrieval-Augmented Generation (RAG) Architecture (Mode A/B/C)</w:t>
+      </w:r>
+    </w:p>
+    <w:p>
+      <w:pPr>
+        <w:spacing w:before="40" w:after="40"/>
+      </w:pPr>
+      <w:r>
+        <w:rPr>
+          <w:color w:val="1E293B"/>
+          <w:sz w:val="19"/>
+        </w:rPr>
+        <w:t>10. Security, Cryptography &amp; Section 15 Recursive SHA-256 Audit Chain</w:t>
+      </w:r>
+    </w:p>
+    <w:p>
+      <w:pPr>
+        <w:spacing w:before="40" w:after="40"/>
+      </w:pPr>
+      <w:r>
+        <w:rPr>
+          <w:color w:val="1E293B"/>
+          <w:sz w:val="19"/>
+        </w:rPr>
+        <w:t>11. Case Intelligence &amp; Specialized Forensic Modules (Legal Engine, Network Graph)</w:t>
+      </w:r>
+    </w:p>
+    <w:p>
+      <w:pPr>
+        <w:spacing w:before="40" w:after="40"/>
+      </w:pPr>
+      <w:r>
+        <w:rPr>
+          <w:color w:val="1E293B"/>
+          <w:sz w:val="19"/>
+        </w:rPr>
+        <w:t>12. Deployment, Operations &amp; Local Startup Guide</w:t>
+      </w:r>
+    </w:p>
+    <w:p>
+      <w:pPr>
+        <w:spacing w:before="40" w:after="40"/>
+      </w:pPr>
+      <w:r>
+        <w:rPr>
+          <w:color w:val="1E293B"/>
+          <w:sz w:val="19"/>
+        </w:rPr>
+        <w:t>13. Backups &amp; Disaster Recovery Protocols</w:t>
+      </w:r>
+    </w:p>
+    <w:p>
+      <w:pPr>
+        <w:spacing w:before="40" w:after="40"/>
+      </w:pPr>
+      <w:r>
+        <w:rPr>
+          <w:color w:val="1E293B"/>
+          <w:sz w:val="19"/>
+        </w:rPr>
+        <w:t>14. Performance, Cost Analysis &amp; Scalability Roadmap</w:t>
+      </w:r>
+    </w:p>
+    <w:p>
+      <w:pPr>
+        <w:spacing w:before="40" w:after="40"/>
+      </w:pPr>
+      <w:r>
+        <w:rPr>
+          <w:color w:val="1E293B"/>
+          <w:sz w:val="19"/>
+        </w:rPr>
+        <w:t>15. Quality Assurance, Testing &amp; Verification Report (29/29 Passed)</w:t>
+      </w:r>
+    </w:p>
+    <w:p>
+      <w:pPr>
+        <w:spacing w:before="40" w:after="40"/>
+      </w:pPr>
+      <w:r>
+        <w:rPr>
+          <w:color w:val="1E293B"/>
+          <w:sz w:val="19"/>
+        </w:rPr>
+        <w:t>16. Known Limitations &amp; Production Readiness Checklist</w:t>
+      </w:r>
+    </w:p>
+    <w:p>
+      <w:pPr>
+        <w:spacing w:before="40" w:after="40"/>
+      </w:pPr>
+      <w:r>
+        <w:rPr>
+          <w:color w:val="1E293B"/>
+          <w:sz w:val="19"/>
+        </w:rPr>
+        <w:t>17. Manager Presentation Scripts (60s, 3m, 10m)</w:t>
+      </w:r>
+    </w:p>
+    <w:p>
+      <w:pPr>
+        <w:spacing w:before="40" w:after="40"/>
+      </w:pPr>
+      <w:r>
+        <w:rPr>
+          <w:color w:val="1E293B"/>
+          <w:sz w:val="19"/>
+        </w:rPr>
+        <w:t>18. 55 Comprehensive Manager Technical Interview Questions &amp; Answers</w:t>
+      </w:r>
+    </w:p>
+    <w:p>
+      <w:pPr>
+        <w:spacing w:before="40" w:after="40"/>
+      </w:pPr>
+      <w:r>
+        <w:rPr>
+          <w:color w:val="1E293B"/>
+          <w:sz w:val="19"/>
+        </w:rPr>
+        <w:t>19. Technical Glossary &amp; Priority Departmental Recommendations</w:t>
+      </w:r>
+    </w:p>
+    <w:p>
+      <w:r>
+        <w:br w:type="page"/>
+      </w:r>
+    </w:p>
+    <w:p>
+      <w:pPr>
+        <w:pStyle w:val="Heading1"/>
+        <w:spacing w:before="360" w:after="120"/>
+      </w:pPr>
+      <w:r>
+        <w:rPr>
+          <w:rFonts w:ascii="Calibri" w:hAnsi="Calibri"/>
+          <w:b/>
+          <w:color w:val="0F5132"/>
+          <w:sz w:val="30"/>
         </w:rPr>
         <w:t>1. Executive Project Overview</w:t>
       </w:r>
@@ -401,20 +649,20 @@
     </w:tbl>
     <w:p>
       <w:pPr>
-        <w:spacing w:after="120"/>
+        <w:spacing w:after="80"/>
       </w:pPr>
     </w:p>
     <w:p>
       <w:pPr>
         <w:pStyle w:val="Heading2"/>
-        <w:spacing w:before="280" w:after="80"/>
+        <w:spacing w:before="260" w:after="80"/>
       </w:pPr>
       <w:r>
         <w:rPr>
           <w:rFonts w:ascii="Calibri" w:hAnsi="Calibri"/>
           <w:b/>
           <w:color w:val="112D4E"/>
-          <w:sz w:val="26"/>
+          <w:sz w:val="24"/>
         </w:rPr>
         <w:t>1.1 Project Hierarchy &amp; Operational Personas</w:t>
       </w:r>
@@ -458,14 +706,14 @@
     <w:p>
       <w:pPr>
         <w:pStyle w:val="Heading2"/>
-        <w:spacing w:before="280" w:after="80"/>
+        <w:spacing w:before="260" w:after="80"/>
       </w:pPr>
       <w:r>
         <w:rPr>
           <w:rFonts w:ascii="Calibri" w:hAnsi="Calibri"/>
           <w:b/>
           <w:color w:val="112D4E"/>
-          <w:sz w:val="26"/>
+          <w:sz w:val="24"/>
         </w:rPr>
         <w:t>1.2 Presentation Scripts for Technical Defense</w:t>
       </w:r>
@@ -473,14 +721,14 @@
     <w:p>
       <w:pPr>
         <w:pStyle w:val="Heading3"/>
-        <w:spacing w:before="200" w:after="40"/>
+        <w:spacing w:before="180" w:after="40"/>
       </w:pPr>
       <w:r>
         <w:rPr>
           <w:rFonts w:ascii="Calibri" w:hAnsi="Calibri"/>
           <w:b/>
           <w:color w:val="1E293B"/>
-          <w:sz w:val="22"/>
+          <w:sz w:val="21"/>
         </w:rPr>
         <w:t>60-Second Elevator Pitch</w:t>
       </w:r>
@@ -508,14 +756,14 @@
     <w:p>
       <w:pPr>
         <w:pStyle w:val="Heading3"/>
-        <w:spacing w:before="200" w:after="40"/>
+        <w:spacing w:before="180" w:after="40"/>
       </w:pPr>
       <w:r>
         <w:rPr>
           <w:rFonts w:ascii="Calibri" w:hAnsi="Calibri"/>
           <w:b/>
           <w:color w:val="1E293B"/>
-          <w:sz w:val="22"/>
+          <w:sz w:val="21"/>
         </w:rPr>
         <w:t>3-Minute Executive Summary</w:t>
       </w:r>
@@ -561,125 +809,88 @@
     </w:p>
     <w:p>
       <w:pPr>
-        <w:pStyle w:val="Heading1"/>
-        <w:spacing w:before="360" w:after="120"/>
+        <w:pStyle w:val="Heading3"/>
+        <w:spacing w:before="180" w:after="40"/>
       </w:pPr>
       <w:r>
         <w:rPr>
           <w:rFonts w:ascii="Calibri" w:hAnsi="Calibri"/>
           <w:b/>
-          <w:color w:val="0F5132"/>
-          <w:sz w:val="32"/>
-        </w:rPr>
-        <w:t>2. End-to-End System Architecture</w:t>
+          <w:color w:val="1E293B"/>
+          <w:sz w:val="21"/>
+        </w:rPr>
+        <w:t>10-Minute Technical Briefing Script</w:t>
       </w:r>
     </w:p>
     <w:p>
       <w:r>
-        <w:t>FIR Sahayak implements a multi-tier, event-audited architecture: React 18 frontend on Vite, asynchronous FastAPI 0.110 backend with Pydantic v2 schemas, dual-adapter storage (SQLite+FTS5 offline / Supabase cloud), and Google Gemini 2.0 Flash multimodal AI integration.</w:t>
+        <w:t>"Respected senior officers and evaluators, I welcome you to the comprehensive technical briefing of FIR Sahayak.</w:t>
+        <w:br/>
+        <w:br/>
+        <w:t>[SLIDE 1 / SECTION 1: PROBLEM &amp; CONTEXT]</w:t>
+        <w:br/>
+        <w:t>In excise enforcement, speed, evidentiary accuracy, and legal rigor determine whether a prosecution stands in court. Under the Andhra Pradesh Prohibition Act 1995 and AP Excise Act 1968, officers handle high volumes of illicit distillation and transport seizures. However, three critical bottlenecks exist:</w:t>
+        <w:br/>
+        <w:t>1. Documentation Delays: Translating scene-of-crime seizure notes into statutory FIR formats takes hours.</w:t>
+        <w:br/>
+        <w:t>2. The July 1, 2024 Legal Transition: Crimes committed prior to July 1, 2024 fall under the Indian Penal Code (IPC 1860) and CrPC 1973; offences from July 1 onwards must strictly charge under the Bharatiya Nyaya Sanhita (BNS 2023) and BNSS 2023. Procedural errors here result in bail or case dismissal.</w:t>
+        <w:br/>
+        <w:t>3. Intelligence Silos: An accused arrested in Kurnool often uses a vehicle registered in Kadapa, financed by an organizer in Vijayawada. Station officers have zero visibility into cross-district co-accused links.</w:t>
+        <w:br/>
+        <w:br/>
+        <w:t>[SLIDE 2 / SECTION 2: PLATFORM CAPABILITIES &amp; DEMONSTRATION WORKFLOW]</w:t>
+        <w:br/>
+        <w:t>FIR Sahayak bridges these gaps across 16 specialized modules:</w:t>
+        <w:br/>
+        <w:t>- Tri-Modal Intake: An officer in the field can dictate seizure particulars in Telugu, type raw narrative text, or photograph a physical memo. The system extracts 12 core metadata fields—including FIR number, contraband volume, seized vehicle, and accused details. Crucially, this creates a 'DRAFT' record that requires mandatory officer review and electronic sign-off.</w:t>
+        <w:br/>
+        <w:t>- Multi-Format Evidence Ingestion: The platform accepts PDF, JPEG, PNG, and WEBP files. Magic-byte validation prevents disguised executable uploads. Documents are SHA-256 hashed, text-extracted, chunked into 400-character windows with 80-character overlap, and indexed into SQLite FTS5.</w:t>
+        <w:br/>
+        <w:t>- Section 26 Grounded RAG: The chatbot copilot provides factual extraction. In 'Mode A (PDF-Only)', answers are restricted solely to the selected file. If the question asks about a fact not in the document, it outputs our certified fallback phrase: 'The requested information was not found in the uploaded FIR PDF' in English, Telugu, or Hindi. Clickable citations instantly open our built-in viewer jumped to the exact physical page.</w:t>
+        <w:br/>
+        <w:t>- Section 27 Legal Section Recommendation: Based on the date of offence, the engine inspects verified India Code statutory corpus, checks mandatory ingredients, and flags missing elements (such as an absent chemical analysis report). Officers must log a formal justification before accepting or rejecting an AI suggestion.</w:t>
+        <w:br/>
+        <w:t>- Syndicate Entity Graph: Powered by RapidFuzz string distance and NetworkX Louvain graph clustering, the platform automatically links co-accused persons and shared vehicles across cases, displaying risk scores and syndicate clusters.</w:t>
+        <w:br/>
+        <w:t>- Statutory Court Documents: It auto-populates Jinja2 templates to produce Section 172 Case Diaries and Section 173 Final Chargesheets, exporting watermarked official PDFs via ReportLab.</w:t>
+        <w:br/>
+        <w:br/>
+        <w:t>[SLIDE 3 / SECTION 3: TECHNICAL ARCHITECTURE &amp; DUAL-STORAGE]</w:t>
+        <w:br/>
+        <w:t>Our software stack is engineered for government reliability:</w:t>
+        <w:br/>
+        <w:t>- Frontend: Single Page Application built on React 18.2, Vite 5.1, and Tailwind CSS. It communicates via an Axios client with automated JWT refresh queuing.</w:t>
+        <w:br/>
+        <w:t>- Backend: High-performance asynchronous FastAPI 0.110 running on Python 3.12, utilizing SQLAlchemy 2.0 ORM.</w:t>
+        <w:br/>
+        <w:t>- Storage Architecture: The system features an innovative dual-adapter design. Today, for local demonstrations and disconnected station houses, it runs completely offline using local SQLite with FTS5 and local evidence file storage. When deployed to the cloud, setting five environment variables activates Supabase PostgreSQL connection pooling and Supabase Private Object Storage with 60-minute expiring signed URLs.</w:t>
+        <w:br/>
+        <w:t>- Security: Passwords use Argon2id with memory-hard parameters. JWT tokens expire in 120 minutes with 7-day refresh token rotation. Hierarchical scoping strictly confines Station officers to their station and District admins to their district, while State directors maintain statewide visibility.</w:t>
+        <w:br/>
+        <w:t>- Cryptographic Audit Trail: Section 15 of our design implements a blockchain-like SHA-256 recursive hash chain where every login, edit, override, and document generation is linked to the previous entry hash. Our `/audit/verify-integrity` endpoint verifies 100% data integrity on demand.</w:t>
+        <w:br/>
+        <w:br/>
+        <w:t>[SLIDE 4 / SECTION 4: TEST RESULTS &amp; PRODUCTION READINESS]</w:t>
+        <w:br/>
+        <w:t>We have executed 29 rigorous automated test cases:</w:t>
+        <w:br/>
+        <w:t>- 6 tests for authentication, self-registration, and token rotation.</w:t>
+        <w:br/>
+        <w:t>- 10 tests for backend data scoping, legal logic, audit hashing, and Section 26 RAG citations.</w:t>
+        <w:br/>
+        <w:t>- 8 tests for image upload magic-byte detection and image-only RAG.</w:t>
+        <w:br/>
+        <w:t>- 5 tests for Supabase storage adapter diagnostics and schema completeness.</w:t>
+        <w:br/>
+        <w:t>All 29 tests pass with zero failures.</w:t>
+        <w:br/>
+        <w:br/>
+        <w:t>In conclusion, FIR Sahayak is a secure, verifiable, and legally grounded platform ready to modernize excise prosecution across Andhra Pradesh. Thank you, and I look forward to your questions."</w:t>
       </w:r>
     </w:p>
     <w:p>
-      <w:pPr>
-        <w:pStyle w:val="Heading2"/>
-        <w:spacing w:before="280" w:after="80"/>
-      </w:pPr>
-      <w:r>
-        <w:rPr>
-          <w:rFonts w:ascii="Calibri" w:hAnsi="Calibri"/>
-          <w:b/>
-          <w:color w:val="112D4E"/>
-          <w:sz w:val="26"/>
-        </w:rPr>
-        <w:t>2.1 Document Ingestion &amp; RAG Lifecycle Walkthrough</w:t>
-      </w:r>
-    </w:p>
-    <w:p>
-      <w:r>
-        <w:rPr>
-          <w:b/>
-        </w:rPr>
-        <w:t xml:space="preserve">1. Selection &amp; Client Validation: </w:t>
-      </w:r>
-      <w:r>
-        <w:t>Officer selects an FIR image/PDF. React validates extensions and creates an instant blob preview.</w:t>
-      </w:r>
-    </w:p>
-    <w:p>
-      <w:r>
-        <w:rPr>
-          <w:b/>
-        </w:rPr>
-        <w:t xml:space="preserve">2. Multipart Transmission: </w:t>
-      </w:r>
-      <w:r>
-        <w:t>Axios dispatches multipart/form-data to /api/v1/documents/upload with Bearer JWT.</w:t>
-      </w:r>
-    </w:p>
-    <w:p>
-      <w:r>
-        <w:rPr>
-          <w:b/>
-        </w:rPr>
-        <w:t xml:space="preserve">3. Magic-Byte Validation: </w:t>
-      </w:r>
-      <w:r>
-        <w:t>FastAPI inspects raw magic bytes (%PDF, \xff\xd8\xff, \x89PNG, RIFF...WEBP). Rejects executables.</w:t>
-      </w:r>
-    </w:p>
-    <w:p>
-      <w:r>
-        <w:rPr>
-          <w:b/>
-        </w:rPr>
-        <w:t xml:space="preserve">4. Storage &amp; SHA-256 Hashing: </w:t>
-      </w:r>
-      <w:r>
-        <w:t>StorageService computes SHA-256 and writes file to data/evidence/ (or Supabase Storage).</w:t>
-      </w:r>
-    </w:p>
-    <w:p>
-      <w:r>
-        <w:rPr>
-          <w:b/>
-        </w:rPr>
-        <w:t xml:space="preserve">5. Multimodal Vision OCR: </w:t>
-      </w:r>
-      <w:r>
-        <w:t>PDFPipeline corrects EXIF orientation and calls Gemini 2.0 Flash to transcribe Telugu/English text.</w:t>
-      </w:r>
-    </w:p>
-    <w:p>
-      <w:r>
-        <w:rPr>
-          <w:b/>
-        </w:rPr>
-        <w:t xml:space="preserve">6. Chunker &amp; FTS5 Indexing: </w:t>
-      </w:r>
-      <w:r>
-        <w:t>Text is sliced into 400-char chunks with 80-char overlaps and indexed in SQLite FTS5 table document_chunks_fts.</w:t>
-      </w:r>
-    </w:p>
-    <w:p>
-      <w:r>
-        <w:rPr>
-          <w:b/>
-        </w:rPr>
-        <w:t xml:space="preserve">7. Mode A Grounded Query: </w:t>
-      </w:r>
-      <w:r>
-        <w:t>Officer asks query in Mode A. FTS5 retrieves chunks strictly isolated by document_id.</w:t>
-      </w:r>
-    </w:p>
-    <w:p>
-      <w:r>
-        <w:rPr>
-          <w:b/>
-        </w:rPr>
-        <w:t xml:space="preserve">8. Grounded Synthesis &amp; Citations: </w:t>
-      </w:r>
-      <w:r>
-        <w:t>Gemini synthesizes answer strictly from chunks, attaching clickable physical page citations.</w:t>
+      <w:r>
+        <w:br w:type="page"/>
       </w:r>
     </w:p>
     <w:p>
@@ -692,14 +903,117 @@
           <w:rFonts w:ascii="Calibri" w:hAnsi="Calibri"/>
           <w:b/>
           <w:color w:val="0F5132"/>
-          <w:sz w:val="32"/>
-        </w:rPr>
-        <w:t>3. Frontend Architecture &amp; All 17 Pages</w:t>
+          <w:sz w:val="30"/>
+        </w:rPr>
+        <w:t>2. End-to-End System Architecture</w:t>
       </w:r>
     </w:p>
     <w:p>
       <w:r>
-        <w:t>The frontend is built on React 18.2.0, Vite 5.1.6, TypeScript 5.2.2, and Tailwind CSS. It features an Axios client with automated JWT refresh queuing and vis-network for syndicate graph rendering.</w:t>
+        <w:t>FIR Sahayak implements a multi-tier, event-audited architecture: React 18 frontend on Vite, asynchronous FastAPI 0.110 backend with Pydantic v2 schemas, dual-adapter storage (SQLite+FTS5 offline / Supabase cloud), and Google Gemini 2.0 Flash multimodal AI integration.</w:t>
+      </w:r>
+    </w:p>
+    <w:p>
+      <w:pPr>
+        <w:pStyle w:val="Heading2"/>
+        <w:spacing w:before="260" w:after="80"/>
+      </w:pPr>
+      <w:r>
+        <w:rPr>
+          <w:rFonts w:ascii="Calibri" w:hAnsi="Calibri"/>
+          <w:b/>
+          <w:color w:val="112D4E"/>
+          <w:sz w:val="24"/>
+        </w:rPr>
+        <w:t>2.1 Document Ingestion &amp; RAG Lifecycle Walkthrough</w:t>
+      </w:r>
+    </w:p>
+    <w:p>
+      <w:r>
+        <w:rPr>
+          <w:b/>
+        </w:rPr>
+        <w:t xml:space="preserve">1. Selection &amp; Client Validation: </w:t>
+      </w:r>
+      <w:r>
+        <w:t>Officer selects an FIR image/PDF. React validates extensions and creates an instant blob preview.</w:t>
+      </w:r>
+    </w:p>
+    <w:p>
+      <w:r>
+        <w:rPr>
+          <w:b/>
+        </w:rPr>
+        <w:t xml:space="preserve">2. Multipart Transmission: </w:t>
+      </w:r>
+      <w:r>
+        <w:t>Axios dispatches multipart/form-data to /api/v1/documents/upload with Bearer JWT.</w:t>
+      </w:r>
+    </w:p>
+    <w:p>
+      <w:r>
+        <w:rPr>
+          <w:b/>
+        </w:rPr>
+        <w:t xml:space="preserve">3. Magic-Byte Validation: </w:t>
+      </w:r>
+      <w:r>
+        <w:t>FastAPI inspects raw magic bytes (%PDF, \xff\xd8\xff, \x89PNG, RIFF...WEBP). Rejects executables.</w:t>
+      </w:r>
+    </w:p>
+    <w:p>
+      <w:r>
+        <w:rPr>
+          <w:b/>
+        </w:rPr>
+        <w:t xml:space="preserve">4. Storage &amp; SHA-256 Hashing: </w:t>
+      </w:r>
+      <w:r>
+        <w:t>StorageService computes SHA-256 and writes file to data/evidence/ (or Supabase Storage).</w:t>
+      </w:r>
+    </w:p>
+    <w:p>
+      <w:r>
+        <w:rPr>
+          <w:b/>
+        </w:rPr>
+        <w:t xml:space="preserve">5. Multimodal Vision OCR: </w:t>
+      </w:r>
+      <w:r>
+        <w:t>PDFPipeline corrects EXIF orientation and calls Gemini 2.0 Flash to transcribe Telugu/English text.</w:t>
+      </w:r>
+    </w:p>
+    <w:p>
+      <w:r>
+        <w:rPr>
+          <w:b/>
+        </w:rPr>
+        <w:t xml:space="preserve">6. Chunker &amp; FTS5 Indexing: </w:t>
+      </w:r>
+      <w:r>
+        <w:t>Text is sliced into 400-char chunks with 80-char overlaps and indexed in SQLite FTS5 table document_chunks_fts.</w:t>
+      </w:r>
+    </w:p>
+    <w:p>
+      <w:r>
+        <w:rPr>
+          <w:b/>
+        </w:rPr>
+        <w:t xml:space="preserve">7. Mode A Grounded Query: </w:t>
+      </w:r>
+      <w:r>
+        <w:t>Officer asks query in Mode A. FTS5 retrieves chunks strictly isolated by document_id.</w:t>
+      </w:r>
+    </w:p>
+    <w:p>
+      <w:r>
+        <w:rPr>
+          <w:b/>
+        </w:rPr>
+        <w:t xml:space="preserve">8. Grounded Synthesis &amp; Citations: </w:t>
+      </w:r>
+      <w:r>
+        <w:t>Gemini synthesizes answer strictly from chunks, attaching clickable physical page citations.</w:t>
       </w:r>
     </w:p>
     <w:p>
@@ -712,7 +1026,219 @@
           <w:rFonts w:ascii="Calibri" w:hAnsi="Calibri"/>
           <w:b/>
           <w:color w:val="0F5132"/>
-          <w:sz w:val="32"/>
+          <w:sz w:val="30"/>
+        </w:rPr>
+        <w:t>3. Frontend Architecture &amp; All 17 Pages</w:t>
+      </w:r>
+    </w:p>
+    <w:p>
+      <w:r>
+        <w:t>The frontend is built on React 18.2.0, Vite 5.1.6, TypeScript 5.2.2, and Tailwind CSS. It features an Axios client with automated JWT refresh queuing and vis-network for syndicate graph rendering.</w:t>
+      </w:r>
+    </w:p>
+    <w:p>
+      <w:r>
+        <w:rPr>
+          <w:b/>
+        </w:rPr>
+        <w:t xml:space="preserve">• Login.tsx: </w:t>
+      </w:r>
+      <w:r>
+        <w:t>Authentication &amp; 26-district registration with AP emblem</w:t>
+      </w:r>
+    </w:p>
+    <w:p>
+      <w:r>
+        <w:rPr>
+          <w:b/>
+        </w:rPr>
+        <w:t xml:space="preserve">• Dashboard.tsx: </w:t>
+      </w:r>
+      <w:r>
+        <w:t>Real-time jurisdiction scoped seizure KPIs</w:t>
+      </w:r>
+    </w:p>
+    <w:p>
+      <w:r>
+        <w:rPr>
+          <w:b/>
+        </w:rPr>
+        <w:t xml:space="preserve">• CaseManagement.tsx: </w:t>
+      </w:r>
+      <w:r>
+        <w:t>Filterable u-FIR case repository</w:t>
+      </w:r>
+    </w:p>
+    <w:p>
+      <w:r>
+        <w:rPr>
+          <w:b/>
+        </w:rPr>
+        <w:t xml:space="preserve">• CaseDetail.tsx: </w:t>
+      </w:r>
+      <w:r>
+        <w:t>Case dossier, evidence viewer, human overrides</w:t>
+      </w:r>
+    </w:p>
+    <w:p>
+      <w:r>
+        <w:rPr>
+          <w:b/>
+        </w:rPr>
+        <w:t xml:space="preserve">• NewCaseIntake.tsx: </w:t>
+      </w:r>
+      <w:r>
+        <w:t>Tri-modal intake (Text, Voice, PDF/Image OCR)</w:t>
+      </w:r>
+    </w:p>
+    <w:p>
+      <w:r>
+        <w:rPr>
+          <w:b/>
+        </w:rPr>
+        <w:t xml:space="preserve">• AICaseSummaries.tsx: </w:t>
+      </w:r>
+      <w:r>
+        <w:t>Cached multilingual 3-5 sentence briefs</w:t>
+      </w:r>
+    </w:p>
+    <w:p>
+      <w:r>
+        <w:rPr>
+          <w:b/>
+        </w:rPr>
+        <w:t xml:space="preserve">• LegalSectionAssistance.tsx: </w:t>
+      </w:r>
+      <w:r>
+        <w:t>Section 27 BNS vs IPC &amp; AP Excise Act engine</w:t>
+      </w:r>
+    </w:p>
+    <w:p>
+      <w:r>
+        <w:rPr>
+          <w:b/>
+        </w:rPr>
+        <w:t xml:space="preserve">• EntityNetwork.tsx: </w:t>
+      </w:r>
+      <w:r>
+        <w:t>Vis-network criminal syndicate graphs</w:t>
+      </w:r>
+    </w:p>
+    <w:p>
+      <w:r>
+        <w:rPr>
+          <w:b/>
+        </w:rPr>
+        <w:t xml:space="preserve">• EntityReviewQueue.tsx: </w:t>
+      </w:r>
+      <w:r>
+        <w:t>RapidFuzz duplicate suspect review queue</w:t>
+      </w:r>
+    </w:p>
+    <w:p>
+      <w:r>
+        <w:rPr>
+          <w:b/>
+        </w:rPr>
+        <w:t xml:space="preserve">• CaseDiaryGenerator.tsx: </w:t>
+      </w:r>
+      <w:r>
+        <w:t>Section 172 CrPC/BNSS Case Diary drafting</w:t>
+      </w:r>
+    </w:p>
+    <w:p>
+      <w:r>
+        <w:rPr>
+          <w:b/>
+        </w:rPr>
+        <w:t xml:space="preserve">• ChargesheetGenerator.tsx: </w:t>
+      </w:r>
+      <w:r>
+        <w:t>Section 173 CrPC/193 BNSS Chargesheet drafting</w:t>
+      </w:r>
+    </w:p>
+    <w:p>
+      <w:r>
+        <w:rPr>
+          <w:b/>
+        </w:rPr>
+        <w:t xml:space="preserve">• AIFIRAssistance.tsx: </w:t>
+      </w:r>
+      <w:r>
+        <w:t>Grounded RAG (Mode A PDF, Mode B Cross-Case, Mode C Image)</w:t>
+      </w:r>
+    </w:p>
+    <w:p>
+      <w:r>
+        <w:rPr>
+          <w:b/>
+        </w:rPr>
+        <w:t xml:space="preserve">• BulkIngestion.tsx: </w:t>
+      </w:r>
+      <w:r>
+        <w:t>Historical CSV/JSON batch ingestion</w:t>
+      </w:r>
+    </w:p>
+    <w:p>
+      <w:r>
+        <w:rPr>
+          <w:b/>
+        </w:rPr>
+        <w:t xml:space="preserve">• EmployeeManagement.tsx: </w:t>
+      </w:r>
+      <w:r>
+        <w:t>Officer directory, approvals, password reset</w:t>
+      </w:r>
+    </w:p>
+    <w:p>
+      <w:r>
+        <w:rPr>
+          <w:b/>
+        </w:rPr>
+        <w:t xml:space="preserve">• AuditTrail.tsx: </w:t>
+      </w:r>
+      <w:r>
+        <w:t>Section 15 recursive SHA-256 hash chain verification</w:t>
+      </w:r>
+    </w:p>
+    <w:p>
+      <w:r>
+        <w:rPr>
+          <w:b/>
+        </w:rPr>
+        <w:t xml:space="preserve">• ReportsAnalytics.tsx: </w:t>
+      </w:r>
+      <w:r>
+        <w:t>Explainable repeat-offender risk scoring</w:t>
+      </w:r>
+    </w:p>
+    <w:p>
+      <w:r>
+        <w:rPr>
+          <w:b/>
+        </w:rPr>
+        <w:t xml:space="preserve">• SettingsHealth.tsx: </w:t>
+      </w:r>
+      <w:r>
+        <w:t>Backend, database, and LLM diagnostic console</w:t>
+      </w:r>
+    </w:p>
+    <w:p>
+      <w:r>
+        <w:br w:type="page"/>
+      </w:r>
+    </w:p>
+    <w:p>
+      <w:pPr>
+        <w:pStyle w:val="Heading1"/>
+        <w:spacing w:before="360" w:after="120"/>
+      </w:pPr>
+      <w:r>
+        <w:rPr>
+          <w:rFonts w:ascii="Calibri" w:hAnsi="Calibri"/>
+          <w:b/>
+          <w:color w:val="0F5132"/>
+          <w:sz w:val="30"/>
         </w:rPr>
         <w:t>4. Backend Architecture &amp; Complete API Inventory</w:t>
       </w:r>
@@ -5356,7 +5882,7 @@
           <w:rFonts w:ascii="Calibri" w:hAnsi="Calibri"/>
           <w:b/>
           <w:color w:val="0F5132"/>
-          <w:sz w:val="32"/>
+          <w:sz w:val="30"/>
         </w:rPr>
         <w:t>5. Database Architecture &amp; Table Inventory</w:t>
       </w:r>
@@ -7300,7 +7826,7 @@
           <w:rFonts w:ascii="Calibri" w:hAnsi="Calibri"/>
           <w:b/>
           <w:color w:val="0F5132"/>
-          <w:sz w:val="32"/>
+          <w:sz w:val="30"/>
         </w:rPr>
         <w:t>6. Testing &amp; Verification Report (29/29 Passed)</w:t>
       </w:r>
@@ -10054,7 +10580,7 @@
           <w:rFonts w:ascii="Calibri" w:hAnsi="Calibri"/>
           <w:b/>
           <w:color w:val="0F5132"/>
-          <w:sz w:val="32"/>
+          <w:sz w:val="30"/>
         </w:rPr>
         <w:t>7. 55 Manager Technical Interview Questions &amp; Answers</w:t>
       </w:r>
@@ -10067,14 +10593,14 @@
     <w:p>
       <w:pPr>
         <w:pStyle w:val="Heading2"/>
-        <w:spacing w:before="280" w:after="80"/>
+        <w:spacing w:before="260" w:after="80"/>
       </w:pPr>
       <w:r>
         <w:rPr>
           <w:rFonts w:ascii="Calibri" w:hAnsi="Calibri"/>
           <w:b/>
           <w:color w:val="112D4E"/>
-          <w:sz w:val="26"/>
+          <w:sz w:val="24"/>
         </w:rPr>
         <w:t>Q1: What problem does FIR Sahayak solve?</w:t>
       </w:r>
@@ -10142,14 +10668,14 @@
     <w:p>
       <w:pPr>
         <w:pStyle w:val="Heading2"/>
-        <w:spacing w:before="280" w:after="80"/>
+        <w:spacing w:before="260" w:after="80"/>
       </w:pPr>
       <w:r>
         <w:rPr>
           <w:rFonts w:ascii="Calibri" w:hAnsi="Calibri"/>
           <w:b/>
           <w:color w:val="112D4E"/>
-          <w:sz w:val="26"/>
+          <w:sz w:val="24"/>
         </w:rPr>
         <w:t>Q2: What is the overall technical architecture of the system?</w:t>
       </w:r>
@@ -10217,14 +10743,14 @@
     <w:p>
       <w:pPr>
         <w:pStyle w:val="Heading2"/>
-        <w:spacing w:before="280" w:after="80"/>
+        <w:spacing w:before="260" w:after="80"/>
       </w:pPr>
       <w:r>
         <w:rPr>
           <w:rFonts w:ascii="Calibri" w:hAnsi="Calibri"/>
           <w:b/>
           <w:color w:val="112D4E"/>
-          <w:sz w:val="26"/>
+          <w:sz w:val="24"/>
         </w:rPr>
         <w:t>Q3: Why did you choose React for the frontend?</w:t>
       </w:r>
@@ -10292,14 +10818,14 @@
     <w:p>
       <w:pPr>
         <w:pStyle w:val="Heading2"/>
-        <w:spacing w:before="280" w:after="80"/>
+        <w:spacing w:before="260" w:after="80"/>
       </w:pPr>
       <w:r>
         <w:rPr>
           <w:rFonts w:ascii="Calibri" w:hAnsi="Calibri"/>
           <w:b/>
           <w:color w:val="112D4E"/>
-          <w:sz w:val="26"/>
+          <w:sz w:val="24"/>
         </w:rPr>
         <w:t>Q4: Why did you choose FastAPI for the backend?</w:t>
       </w:r>
@@ -10367,14 +10893,14 @@
     <w:p>
       <w:pPr>
         <w:pStyle w:val="Heading2"/>
-        <w:spacing w:before="280" w:after="80"/>
+        <w:spacing w:before="260" w:after="80"/>
       </w:pPr>
       <w:r>
         <w:rPr>
           <w:rFonts w:ascii="Calibri" w:hAnsi="Calibri"/>
           <w:b/>
           <w:color w:val="112D4E"/>
-          <w:sz w:val="26"/>
+          <w:sz w:val="24"/>
         </w:rPr>
         <w:t>Q5: Why is Supabase in the architecture, and what role does it play?</w:t>
       </w:r>
@@ -10442,14 +10968,14 @@
     <w:p>
       <w:pPr>
         <w:pStyle w:val="Heading2"/>
-        <w:spacing w:before="280" w:after="80"/>
+        <w:spacing w:before="260" w:after="80"/>
       </w:pPr>
       <w:r>
         <w:rPr>
           <w:rFonts w:ascii="Calibri" w:hAnsi="Calibri"/>
           <w:b/>
           <w:color w:val="112D4E"/>
-          <w:sz w:val="26"/>
+          <w:sz w:val="24"/>
         </w:rPr>
         <w:t>Q6: Is Supabase the database, file storage, or both?</w:t>
       </w:r>
@@ -10517,14 +11043,14 @@
     <w:p>
       <w:pPr>
         <w:pStyle w:val="Heading2"/>
-        <w:spacing w:before="280" w:after="80"/>
+        <w:spacing w:before="260" w:after="80"/>
       </w:pPr>
       <w:r>
         <w:rPr>
           <w:rFonts w:ascii="Calibri" w:hAnsi="Calibri"/>
           <w:b/>
           <w:color w:val="112D4E"/>
-          <w:sz w:val="26"/>
+          <w:sz w:val="24"/>
         </w:rPr>
         <w:t>Q7: What exactly is stored in the database?</w:t>
       </w:r>
@@ -10592,14 +11118,14 @@
     <w:p>
       <w:pPr>
         <w:pStyle w:val="Heading2"/>
-        <w:spacing w:before="280" w:after="80"/>
+        <w:spacing w:before="260" w:after="80"/>
       </w:pPr>
       <w:r>
         <w:rPr>
           <w:rFonts w:ascii="Calibri" w:hAnsi="Calibri"/>
           <w:b/>
           <w:color w:val="112D4E"/>
-          <w:sz w:val="26"/>
+          <w:sz w:val="24"/>
         </w:rPr>
         <w:t>Q8: Where are uploaded FIR documents and photos stored?</w:t>
       </w:r>
@@ -10667,14 +11193,14 @@
     <w:p>
       <w:pPr>
         <w:pStyle w:val="Heading2"/>
-        <w:spacing w:before="280" w:after="80"/>
+        <w:spacing w:before="260" w:after="80"/>
       </w:pPr>
       <w:r>
         <w:rPr>
           <w:rFonts w:ascii="Calibri" w:hAnsi="Calibri"/>
           <w:b/>
           <w:color w:val="112D4E"/>
-          <w:sz w:val="26"/>
+          <w:sz w:val="24"/>
         </w:rPr>
         <w:t>Q9: How does the frontend communicate with the backend?</w:t>
       </w:r>
@@ -10742,14 +11268,14 @@
     <w:p>
       <w:pPr>
         <w:pStyle w:val="Heading2"/>
-        <w:spacing w:before="280" w:after="80"/>
+        <w:spacing w:before="260" w:after="80"/>
       </w:pPr>
       <w:r>
         <w:rPr>
           <w:rFonts w:ascii="Calibri" w:hAnsi="Calibri"/>
           <w:b/>
           <w:color w:val="112D4E"/>
-          <w:sz w:val="26"/>
+          <w:sz w:val="24"/>
         </w:rPr>
         <w:t>Q10: How is authentication implemented?</w:t>
       </w:r>
@@ -10817,14 +11343,14 @@
     <w:p>
       <w:pPr>
         <w:pStyle w:val="Heading2"/>
-        <w:spacing w:before="280" w:after="80"/>
+        <w:spacing w:before="260" w:after="80"/>
       </w:pPr>
       <w:r>
         <w:rPr>
           <w:rFonts w:ascii="Calibri" w:hAnsi="Calibri"/>
           <w:b/>
           <w:color w:val="112D4E"/>
-          <w:sz w:val="26"/>
+          <w:sz w:val="24"/>
         </w:rPr>
         <w:t>Q11: How do STATION, DISTRICT, and STATE permissions and data scoping work?</w:t>
       </w:r>
@@ -10892,14 +11418,14 @@
     <w:p>
       <w:pPr>
         <w:pStyle w:val="Heading2"/>
-        <w:spacing w:before="280" w:after="80"/>
+        <w:spacing w:before="260" w:after="80"/>
       </w:pPr>
       <w:r>
         <w:rPr>
           <w:rFonts w:ascii="Calibri" w:hAnsi="Calibri"/>
           <w:b/>
           <w:color w:val="112D4E"/>
-          <w:sz w:val="26"/>
+          <w:sz w:val="24"/>
         </w:rPr>
         <w:t>Q12: What happens under the hood when an FIR PDF is uploaded?</w:t>
       </w:r>
@@ -10967,14 +11493,14 @@
     <w:p>
       <w:pPr>
         <w:pStyle w:val="Heading2"/>
-        <w:spacing w:before="280" w:after="80"/>
+        <w:spacing w:before="260" w:after="80"/>
       </w:pPr>
       <w:r>
         <w:rPr>
           <w:rFonts w:ascii="Calibri" w:hAnsi="Calibri"/>
           <w:b/>
           <w:color w:val="112D4E"/>
-          <w:sz w:val="26"/>
+          <w:sz w:val="24"/>
         </w:rPr>
         <w:t>Q13: How does image and photograph OCR work?</w:t>
       </w:r>
@@ -11042,14 +11568,14 @@
     <w:p>
       <w:pPr>
         <w:pStyle w:val="Heading2"/>
-        <w:spacing w:before="280" w:after="80"/>
+        <w:spacing w:before="260" w:after="80"/>
       </w:pPr>
       <w:r>
         <w:rPr>
           <w:rFonts w:ascii="Calibri" w:hAnsi="Calibri"/>
           <w:b/>
           <w:color w:val="112D4E"/>
-          <w:sz w:val="26"/>
+          <w:sz w:val="24"/>
         </w:rPr>
         <w:t>Q14: Which specific AI models are actually used in the project?</w:t>
       </w:r>
@@ -11117,14 +11643,14 @@
     <w:p>
       <w:pPr>
         <w:pStyle w:val="Heading2"/>
-        <w:spacing w:before="280" w:after="80"/>
+        <w:spacing w:before="260" w:after="80"/>
       </w:pPr>
       <w:r>
         <w:rPr>
           <w:rFonts w:ascii="Calibri" w:hAnsi="Calibri"/>
           <w:b/>
           <w:color w:val="112D4E"/>
-          <w:sz w:val="26"/>
+          <w:sz w:val="24"/>
         </w:rPr>
         <w:t>Q15: What is RAG and how does FIR Sahayak implement it?</w:t>
       </w:r>
@@ -11192,14 +11718,14 @@
     <w:p>
       <w:pPr>
         <w:pStyle w:val="Heading2"/>
-        <w:spacing w:before="280" w:after="80"/>
+        <w:spacing w:before="260" w:after="80"/>
       </w:pPr>
       <w:r>
         <w:rPr>
           <w:rFonts w:ascii="Calibri" w:hAnsi="Calibri"/>
           <w:b/>
           <w:color w:val="112D4E"/>
-          <w:sz w:val="26"/>
+          <w:sz w:val="24"/>
         </w:rPr>
         <w:t>Q16: How are documents chunked and indexed?</w:t>
       </w:r>
@@ -11267,14 +11793,14 @@
     <w:p>
       <w:pPr>
         <w:pStyle w:val="Heading2"/>
-        <w:spacing w:before="280" w:after="80"/>
+        <w:spacing w:before="260" w:after="80"/>
       </w:pPr>
       <w:r>
         <w:rPr>
           <w:rFonts w:ascii="Calibri" w:hAnsi="Calibri"/>
           <w:b/>
           <w:color w:val="112D4E"/>
-          <w:sz w:val="26"/>
+          <w:sz w:val="24"/>
         </w:rPr>
         <w:t>Q17: How does PDF-only RAG prevent cross-document data leakage?</w:t>
       </w:r>
@@ -11342,14 +11868,14 @@
     <w:p>
       <w:pPr>
         <w:pStyle w:val="Heading2"/>
-        <w:spacing w:before="280" w:after="80"/>
+        <w:spacing w:before="260" w:after="80"/>
       </w:pPr>
       <w:r>
         <w:rPr>
           <w:rFonts w:ascii="Calibri" w:hAnsi="Calibri"/>
           <w:b/>
           <w:color w:val="112D4E"/>
-          <w:sz w:val="26"/>
+          <w:sz w:val="24"/>
         </w:rPr>
         <w:t>Q18: How are page citations validated?</w:t>
       </w:r>
@@ -11417,14 +11943,14 @@
     <w:p>
       <w:pPr>
         <w:pStyle w:val="Heading2"/>
-        <w:spacing w:before="280" w:after="80"/>
+        <w:spacing w:before="260" w:after="80"/>
       </w:pPr>
       <w:r>
         <w:rPr>
           <w:rFonts w:ascii="Calibri" w:hAnsi="Calibri"/>
           <w:b/>
           <w:color w:val="112D4E"/>
-          <w:sz w:val="26"/>
+          <w:sz w:val="24"/>
         </w:rPr>
         <w:t>Q19: What happens when the requested information is absent from the document?</w:t>
       </w:r>
@@ -11492,14 +12018,14 @@
     <w:p>
       <w:pPr>
         <w:pStyle w:val="Heading2"/>
-        <w:spacing w:before="280" w:after="80"/>
+        <w:spacing w:before="260" w:after="80"/>
       </w:pPr>
       <w:r>
         <w:rPr>
           <w:rFonts w:ascii="Calibri" w:hAnsi="Calibri"/>
           <w:b/>
           <w:color w:val="112D4E"/>
-          <w:sz w:val="26"/>
+          <w:sz w:val="24"/>
         </w:rPr>
         <w:t>Q20: How does the system recommend legal sections and handle the BNS 2023 transition?</w:t>
       </w:r>
@@ -11567,14 +12093,14 @@
     <w:p>
       <w:pPr>
         <w:pStyle w:val="Heading2"/>
-        <w:spacing w:before="280" w:after="80"/>
+        <w:spacing w:before="260" w:after="80"/>
       </w:pPr>
       <w:r>
         <w:rPr>
           <w:rFonts w:ascii="Calibri" w:hAnsi="Calibri"/>
           <w:b/>
           <w:color w:val="112D4E"/>
-          <w:sz w:val="26"/>
+          <w:sz w:val="24"/>
         </w:rPr>
         <w:t>Q21: How are duplicate suspect entities identified and merged?</w:t>
       </w:r>
@@ -11642,14 +12168,14 @@
     <w:p>
       <w:pPr>
         <w:pStyle w:val="Heading2"/>
-        <w:spacing w:before="280" w:after="80"/>
+        <w:spacing w:before="260" w:after="80"/>
       </w:pPr>
       <w:r>
         <w:rPr>
           <w:rFonts w:ascii="Calibri" w:hAnsi="Calibri"/>
           <w:b/>
           <w:color w:val="112D4E"/>
-          <w:sz w:val="26"/>
+          <w:sz w:val="24"/>
         </w:rPr>
         <w:t>Q22: How does the entity network graph work?</w:t>
       </w:r>
@@ -11717,14 +12243,14 @@
     <w:p>
       <w:pPr>
         <w:pStyle w:val="Heading2"/>
-        <w:spacing w:before="280" w:after="80"/>
+        <w:spacing w:before="260" w:after="80"/>
       </w:pPr>
       <w:r>
         <w:rPr>
           <w:rFonts w:ascii="Calibri" w:hAnsi="Calibri"/>
           <w:b/>
           <w:color w:val="112D4E"/>
-          <w:sz w:val="26"/>
+          <w:sz w:val="24"/>
         </w:rPr>
         <w:t>Q23: How are Case Diaries and Chargesheets generated?</w:t>
       </w:r>
@@ -11792,14 +12318,14 @@
     <w:p>
       <w:pPr>
         <w:pStyle w:val="Heading2"/>
-        <w:spacing w:before="280" w:after="80"/>
+        <w:spacing w:before="260" w:after="80"/>
       </w:pPr>
       <w:r>
         <w:rPr>
           <w:rFonts w:ascii="Calibri" w:hAnsi="Calibri"/>
           <w:b/>
           <w:color w:val="112D4E"/>
-          <w:sz w:val="26"/>
+          <w:sz w:val="24"/>
         </w:rPr>
         <w:t>Q24: How do you verify that database persistence works across page refreshes and backend restarts?</w:t>
       </w:r>
@@ -11867,14 +12393,14 @@
     <w:p>
       <w:pPr>
         <w:pStyle w:val="Heading2"/>
-        <w:spacing w:before="280" w:after="80"/>
+        <w:spacing w:before="260" w:after="80"/>
       </w:pPr>
       <w:r>
         <w:rPr>
           <w:rFonts w:ascii="Calibri" w:hAnsi="Calibri"/>
           <w:b/>
           <w:color w:val="112D4E"/>
-          <w:sz w:val="26"/>
+          <w:sz w:val="24"/>
         </w:rPr>
         <w:t>Q25: How are database backups taken and restored?</w:t>
       </w:r>
@@ -11942,14 +12468,14 @@
     <w:p>
       <w:pPr>
         <w:pStyle w:val="Heading2"/>
-        <w:spacing w:before="280" w:after="80"/>
+        <w:spacing w:before="260" w:after="80"/>
       </w:pPr>
       <w:r>
         <w:rPr>
           <w:rFonts w:ascii="Calibri" w:hAnsi="Calibri"/>
           <w:b/>
           <w:color w:val="112D4E"/>
-          <w:sz w:val="26"/>
+          <w:sz w:val="24"/>
         </w:rPr>
         <w:t>Q26: How are evidence documents protected from unauthorized access?</w:t>
       </w:r>
@@ -12017,14 +12543,14 @@
     <w:p>
       <w:pPr>
         <w:pStyle w:val="Heading2"/>
-        <w:spacing w:before="280" w:after="80"/>
+        <w:spacing w:before="260" w:after="80"/>
       </w:pPr>
       <w:r>
         <w:rPr>
           <w:rFonts w:ascii="Calibri" w:hAnsi="Calibri"/>
           <w:b/>
           <w:color w:val="112D4E"/>
-          <w:sz w:val="26"/>
+          <w:sz w:val="24"/>
         </w:rPr>
         <w:t>Q27: How are API keys and secrets stored and managed?</w:t>
       </w:r>
@@ -12092,14 +12618,14 @@
     <w:p>
       <w:pPr>
         <w:pStyle w:val="Heading2"/>
-        <w:spacing w:before="280" w:after="80"/>
+        <w:spacing w:before="260" w:after="80"/>
       </w:pPr>
       <w:r>
         <w:rPr>
           <w:rFonts w:ascii="Calibri" w:hAnsi="Calibri"/>
           <w:b/>
           <w:color w:val="112D4E"/>
-          <w:sz w:val="26"/>
+          <w:sz w:val="24"/>
         </w:rPr>
         <w:t>Q28: What do Supabase Storage policies do?</w:t>
       </w:r>
@@ -12167,14 +12693,14 @@
     <w:p>
       <w:pPr>
         <w:pStyle w:val="Heading2"/>
-        <w:spacing w:before="280" w:after="80"/>
+        <w:spacing w:before="260" w:after="80"/>
       </w:pPr>
       <w:r>
         <w:rPr>
           <w:rFonts w:ascii="Calibri" w:hAnsi="Calibri"/>
           <w:b/>
           <w:color w:val="112D4E"/>
-          <w:sz w:val="26"/>
+          <w:sz w:val="24"/>
         </w:rPr>
         <w:t>Q29: How is the project tested, and what is the current test coverage?</w:t>
       </w:r>
@@ -12242,14 +12768,14 @@
     <w:p>
       <w:pPr>
         <w:pStyle w:val="Heading2"/>
-        <w:spacing w:before="280" w:after="80"/>
+        <w:spacing w:before="260" w:after="80"/>
       </w:pPr>
       <w:r>
         <w:rPr>
           <w:rFonts w:ascii="Calibri" w:hAnsi="Calibri"/>
           <w:b/>
           <w:color w:val="112D4E"/>
-          <w:sz w:val="26"/>
+          <w:sz w:val="24"/>
         </w:rPr>
         <w:t>Q30: How is the application deployed locally and what are the startup commands?</w:t>
       </w:r>
@@ -12317,14 +12843,14 @@
     <w:p>
       <w:pPr>
         <w:pStyle w:val="Heading2"/>
-        <w:spacing w:before="280" w:after="80"/>
+        <w:spacing w:before="260" w:after="80"/>
       </w:pPr>
       <w:r>
         <w:rPr>
           <w:rFonts w:ascii="Calibri" w:hAnsi="Calibri"/>
           <w:b/>
           <w:color w:val="112D4E"/>
-          <w:sz w:val="26"/>
+          <w:sz w:val="24"/>
         </w:rPr>
         <w:t>Q31: What happens when the external AI provider is unavailable?</w:t>
       </w:r>
@@ -12392,14 +12918,14 @@
     <w:p>
       <w:pPr>
         <w:pStyle w:val="Heading2"/>
-        <w:spacing w:before="280" w:after="80"/>
+        <w:spacing w:before="260" w:after="80"/>
       </w:pPr>
       <w:r>
         <w:rPr>
           <w:rFonts w:ascii="Calibri" w:hAnsi="Calibri"/>
           <w:b/>
           <w:color w:val="112D4E"/>
-          <w:sz w:val="26"/>
+          <w:sz w:val="24"/>
         </w:rPr>
         <w:t>Q32: What are the main architectural limitations of the current prototype?</w:t>
       </w:r>
@@ -12467,14 +12993,14 @@
     <w:p>
       <w:pPr>
         <w:pStyle w:val="Heading2"/>
-        <w:spacing w:before="280" w:after="80"/>
+        <w:spacing w:before="260" w:after="80"/>
       </w:pPr>
       <w:r>
         <w:rPr>
           <w:rFonts w:ascii="Calibri" w:hAnsi="Calibri"/>
           <w:b/>
           <w:color w:val="112D4E"/>
-          <w:sz w:val="26"/>
+          <w:sz w:val="24"/>
         </w:rPr>
         <w:t>Q33: What must be improved before deploying to a live departmental pilot?</w:t>
       </w:r>
@@ -12542,14 +13068,14 @@
     <w:p>
       <w:pPr>
         <w:pStyle w:val="Heading2"/>
-        <w:spacing w:before="280" w:after="80"/>
+        <w:spacing w:before="260" w:after="80"/>
       </w:pPr>
       <w:r>
         <w:rPr>
           <w:rFonts w:ascii="Calibri" w:hAnsi="Calibri"/>
           <w:b/>
           <w:color w:val="112D4E"/>
-          <w:sz w:val="26"/>
+          <w:sz w:val="24"/>
         </w:rPr>
         <w:t>Q34: What are the estimated operating costs of running FIR Sahayak?</w:t>
       </w:r>
@@ -12617,14 +13143,14 @@
     <w:p>
       <w:pPr>
         <w:pStyle w:val="Heading2"/>
-        <w:spacing w:before="280" w:after="80"/>
+        <w:spacing w:before="260" w:after="80"/>
       </w:pPr>
       <w:r>
         <w:rPr>
           <w:rFonts w:ascii="Calibri" w:hAnsi="Calibri"/>
           <w:b/>
           <w:color w:val="112D4E"/>
-          <w:sz w:val="26"/>
+          <w:sz w:val="24"/>
         </w:rPr>
         <w:t>Q35: How could the system scale to support thousands of simultaneous excise officers?</w:t>
       </w:r>
@@ -12692,14 +13218,14 @@
     <w:p>
       <w:pPr>
         <w:pStyle w:val="Heading2"/>
-        <w:spacing w:before="280" w:after="80"/>
+        <w:spacing w:before="260" w:after="80"/>
       </w:pPr>
       <w:r>
         <w:rPr>
           <w:rFonts w:ascii="Calibri" w:hAnsi="Calibri"/>
           <w:b/>
           <w:color w:val="112D4E"/>
-          <w:sz w:val="26"/>
+          <w:sz w:val="24"/>
         </w:rPr>
         <w:t>Q36: What was the exact root cause of the PDF-only upload error and how was it resolved?</w:t>
       </w:r>
@@ -12767,14 +13293,14 @@
     <w:p>
       <w:pPr>
         <w:pStyle w:val="Heading2"/>
-        <w:spacing w:before="280" w:after="80"/>
+        <w:spacing w:before="260" w:after="80"/>
       </w:pPr>
       <w:r>
         <w:rPr>
           <w:rFonts w:ascii="Calibri" w:hAnsi="Calibri"/>
           <w:b/>
           <w:color w:val="112D4E"/>
-          <w:sz w:val="26"/>
+          <w:sz w:val="24"/>
         </w:rPr>
         <w:t>Q37: How does the SHA-256 recursive cryptographic audit hash chain work?</w:t>
       </w:r>
@@ -12842,14 +13368,14 @@
     <w:p>
       <w:pPr>
         <w:pStyle w:val="Heading2"/>
-        <w:spacing w:before="280" w:after="80"/>
+        <w:spacing w:before="260" w:after="80"/>
       </w:pPr>
       <w:r>
         <w:rPr>
           <w:rFonts w:ascii="Calibri" w:hAnsi="Calibri"/>
           <w:b/>
           <w:color w:val="112D4E"/>
-          <w:sz w:val="26"/>
+          <w:sz w:val="24"/>
         </w:rPr>
         <w:t>Q38: How does the tri-modal case intake pipeline work in NewCaseIntake.tsx?</w:t>
       </w:r>
@@ -12917,14 +13443,14 @@
     <w:p>
       <w:pPr>
         <w:pStyle w:val="Heading2"/>
-        <w:spacing w:before="280" w:after="80"/>
+        <w:spacing w:before="260" w:after="80"/>
       </w:pPr>
       <w:r>
         <w:rPr>
           <w:rFonts w:ascii="Calibri" w:hAnsi="Calibri"/>
           <w:b/>
           <w:color w:val="112D4E"/>
-          <w:sz w:val="26"/>
+          <w:sz w:val="24"/>
         </w:rPr>
         <w:t>Q39: How are field provenance and human overrides tracked in CaseDetail.tsx?</w:t>
       </w:r>
@@ -12992,14 +13518,14 @@
     <w:p>
       <w:pPr>
         <w:pStyle w:val="Heading2"/>
-        <w:spacing w:before="280" w:after="80"/>
+        <w:spacing w:before="260" w:after="80"/>
       </w:pPr>
       <w:r>
         <w:rPr>
           <w:rFonts w:ascii="Calibri" w:hAnsi="Calibri"/>
           <w:b/>
           <w:color w:val="112D4E"/>
-          <w:sz w:val="26"/>
+          <w:sz w:val="24"/>
         </w:rPr>
         <w:t>Q40: What is the difference between Mode A, Mode B, and Mode C in AI FIR Assistance?</w:t>
       </w:r>
@@ -13067,14 +13593,14 @@
     <w:p>
       <w:pPr>
         <w:pStyle w:val="Heading2"/>
-        <w:spacing w:before="280" w:after="80"/>
+        <w:spacing w:before="260" w:after="80"/>
       </w:pPr>
       <w:r>
         <w:rPr>
           <w:rFonts w:ascii="Calibri" w:hAnsi="Calibri"/>
           <w:b/>
           <w:color w:val="112D4E"/>
-          <w:sz w:val="26"/>
+          <w:sz w:val="24"/>
         </w:rPr>
         <w:t>Q41: Why did you use SQLite FTS5 instead of pgvector or ChromaDB for the local prototype?</w:t>
       </w:r>
@@ -13142,14 +13668,14 @@
     <w:p>
       <w:pPr>
         <w:pStyle w:val="Heading2"/>
-        <w:spacing w:before="280" w:after="80"/>
+        <w:spacing w:before="260" w:after="80"/>
       </w:pPr>
       <w:r>
         <w:rPr>
           <w:rFonts w:ascii="Calibri" w:hAnsi="Calibri"/>
           <w:b/>
           <w:color w:val="112D4E"/>
-          <w:sz w:val="26"/>
+          <w:sz w:val="24"/>
         </w:rPr>
         <w:t>Q42: How are multilingual summaries generated in AICaseSummaries.tsx?</w:t>
       </w:r>
@@ -13217,14 +13743,14 @@
     <w:p>
       <w:pPr>
         <w:pStyle w:val="Heading2"/>
-        <w:spacing w:before="280" w:after="80"/>
+        <w:spacing w:before="260" w:after="80"/>
       </w:pPr>
       <w:r>
         <w:rPr>
           <w:rFonts w:ascii="Calibri" w:hAnsi="Calibri"/>
           <w:b/>
           <w:color w:val="112D4E"/>
-          <w:sz w:val="26"/>
+          <w:sz w:val="24"/>
         </w:rPr>
         <w:t>Q43: How does the employee approval workflow function in EmployeeManagement.tsx?</w:t>
       </w:r>
@@ -13292,14 +13818,14 @@
     <w:p>
       <w:pPr>
         <w:pStyle w:val="Heading2"/>
-        <w:spacing w:before="280" w:after="80"/>
+        <w:spacing w:before="260" w:after="80"/>
       </w:pPr>
       <w:r>
         <w:rPr>
           <w:rFonts w:ascii="Calibri" w:hAnsi="Calibri"/>
           <w:b/>
           <w:color w:val="112D4E"/>
-          <w:sz w:val="26"/>
+          <w:sz w:val="24"/>
         </w:rPr>
         <w:t>Q44: How does the bulk historical ingestion pipeline handle large CSV or JSON files?</w:t>
       </w:r>
@@ -13367,14 +13893,14 @@
     <w:p>
       <w:pPr>
         <w:pStyle w:val="Heading2"/>
-        <w:spacing w:before="280" w:after="80"/>
+        <w:spacing w:before="260" w:after="80"/>
       </w:pPr>
       <w:r>
         <w:rPr>
           <w:rFonts w:ascii="Calibri" w:hAnsi="Calibri"/>
           <w:b/>
           <w:color w:val="112D4E"/>
-          <w:sz w:val="26"/>
+          <w:sz w:val="24"/>
         </w:rPr>
         <w:t>Q45: How does the system ensure CORS and CSRF protection?</w:t>
       </w:r>
@@ -13442,14 +13968,14 @@
     <w:p>
       <w:pPr>
         <w:pStyle w:val="Heading2"/>
-        <w:spacing w:before="280" w:after="80"/>
+        <w:spacing w:before="260" w:after="80"/>
       </w:pPr>
       <w:r>
         <w:rPr>
           <w:rFonts w:ascii="Calibri" w:hAnsi="Calibri"/>
           <w:b/>
           <w:color w:val="112D4E"/>
-          <w:sz w:val="26"/>
+          <w:sz w:val="24"/>
         </w:rPr>
         <w:t>Q46: How does the Repeat Offender analytics algorithm compute risk scores in ReportsAnalytics.tsx?</w:t>
       </w:r>
@@ -13517,14 +14043,14 @@
     <w:p>
       <w:pPr>
         <w:pStyle w:val="Heading2"/>
-        <w:spacing w:before="280" w:after="80"/>
+        <w:spacing w:before="260" w:after="80"/>
       </w:pPr>
       <w:r>
         <w:rPr>
           <w:rFonts w:ascii="Calibri" w:hAnsi="Calibri"/>
           <w:b/>
           <w:color w:val="112D4E"/>
-          <w:sz w:val="26"/>
+          <w:sz w:val="24"/>
         </w:rPr>
         <w:t>Q47: How are official Andhra Pradesh government branding assets integrated?</w:t>
       </w:r>
@@ -13592,14 +14118,14 @@
     <w:p>
       <w:pPr>
         <w:pStyle w:val="Heading2"/>
-        <w:spacing w:before="280" w:after="80"/>
+        <w:spacing w:before="260" w:after="80"/>
       </w:pPr>
       <w:r>
         <w:rPr>
           <w:rFonts w:ascii="Calibri" w:hAnsi="Calibri"/>
           <w:b/>
           <w:color w:val="112D4E"/>
-          <w:sz w:val="26"/>
+          <w:sz w:val="24"/>
         </w:rPr>
         <w:t>Q48: How does the system handle multi-language localization?</w:t>
       </w:r>
@@ -13667,14 +14193,14 @@
     <w:p>
       <w:pPr>
         <w:pStyle w:val="Heading2"/>
-        <w:spacing w:before="280" w:after="80"/>
+        <w:spacing w:before="260" w:after="80"/>
       </w:pPr>
       <w:r>
         <w:rPr>
           <w:rFonts w:ascii="Calibri" w:hAnsi="Calibri"/>
           <w:b/>
           <w:color w:val="112D4E"/>
-          <w:sz w:val="26"/>
+          <w:sz w:val="24"/>
         </w:rPr>
         <w:t>Q49: What happens if a user submits a soft-deleted or archived case?</w:t>
       </w:r>
@@ -13742,14 +14268,14 @@
     <w:p>
       <w:pPr>
         <w:pStyle w:val="Heading2"/>
-        <w:spacing w:before="280" w:after="80"/>
+        <w:spacing w:before="260" w:after="80"/>
       </w:pPr>
       <w:r>
         <w:rPr>
           <w:rFonts w:ascii="Calibri" w:hAnsi="Calibri"/>
           <w:b/>
           <w:color w:val="112D4E"/>
-          <w:sz w:val="26"/>
+          <w:sz w:val="24"/>
         </w:rPr>
         <w:t>Q50: How is the cryptographic integrity of the audit chain verified on demand?</w:t>
       </w:r>
@@ -13817,14 +14343,14 @@
     <w:p>
       <w:pPr>
         <w:pStyle w:val="Heading2"/>
-        <w:spacing w:before="280" w:after="80"/>
+        <w:spacing w:before="260" w:after="80"/>
       </w:pPr>
       <w:r>
         <w:rPr>
           <w:rFonts w:ascii="Calibri" w:hAnsi="Calibri"/>
           <w:b/>
           <w:color w:val="112D4E"/>
-          <w:sz w:val="26"/>
+          <w:sz w:val="24"/>
         </w:rPr>
         <w:t>Q51: Why is the backend database URL configured with both async and sync engines?</w:t>
       </w:r>
@@ -13892,14 +14418,14 @@
     <w:p>
       <w:pPr>
         <w:pStyle w:val="Heading2"/>
-        <w:spacing w:before="280" w:after="80"/>
+        <w:spacing w:before="260" w:after="80"/>
       </w:pPr>
       <w:r>
         <w:rPr>
           <w:rFonts w:ascii="Calibri" w:hAnsi="Calibri"/>
           <w:b/>
           <w:color w:val="112D4E"/>
-          <w:sz w:val="26"/>
+          <w:sz w:val="24"/>
         </w:rPr>
         <w:t>Q52: How does the system ensure that passwords meet departmental security standards?</w:t>
       </w:r>
@@ -13967,14 +14493,14 @@
     <w:p>
       <w:pPr>
         <w:pStyle w:val="Heading2"/>
-        <w:spacing w:before="280" w:after="80"/>
+        <w:spacing w:before="260" w:after="80"/>
       </w:pPr>
       <w:r>
         <w:rPr>
           <w:rFonts w:ascii="Calibri" w:hAnsi="Calibri"/>
           <w:b/>
           <w:color w:val="112D4E"/>
-          <w:sz w:val="26"/>
+          <w:sz w:val="24"/>
         </w:rPr>
         <w:t>Q53: What is the role of Jinja2 and ReportLab in document generation?</w:t>
       </w:r>
@@ -14042,14 +14568,14 @@
     <w:p>
       <w:pPr>
         <w:pStyle w:val="Heading2"/>
-        <w:spacing w:before="280" w:after="80"/>
+        <w:spacing w:before="260" w:after="80"/>
       </w:pPr>
       <w:r>
         <w:rPr>
           <w:rFonts w:ascii="Calibri" w:hAnsi="Calibri"/>
           <w:b/>
           <w:color w:val="112D4E"/>
-          <w:sz w:val="26"/>
+          <w:sz w:val="24"/>
         </w:rPr>
         <w:t>Q54: How does the system prevent SQL injection vulnerabilities?</w:t>
       </w:r>
@@ -14117,14 +14643,14 @@
     <w:p>
       <w:pPr>
         <w:pStyle w:val="Heading2"/>
-        <w:spacing w:before="280" w:after="80"/>
+        <w:spacing w:before="260" w:after="80"/>
       </w:pPr>
       <w:r>
         <w:rPr>
           <w:rFonts w:ascii="Calibri" w:hAnsi="Calibri"/>
           <w:b/>
           <w:color w:val="112D4E"/>
-          <w:sz w:val="26"/>
+          <w:sz w:val="24"/>
         </w:rPr>
         <w:t>Q55: If you are asked to demonstrate FIR Sahayak live right now, what is your step-by-step walkthrough?</w:t>
       </w:r>

</xml_diff>